<commit_message>
fix correct dokument and failing rules
</commit_message>
<xml_diff>
--- a/docs/test-documents/thesis-validator-test-correct.docx
+++ b/docs/test-documents/thesis-validator-test-correct.docx
@@ -5215,22 +5215,13 @@
         <w:t>Käesolev lõik on näidistekst, mida kasutatakse dokumendi vormistuse testimiseks. Tekst ei oma sisulist tähendust ning on koostatud üksnes vormistusnõuete kontrollimise eesmärgil. Lõigu pikkus on valitud selliselt, et see vastaks tüüpilise akadeemilise teksti mahule.</w:t>
       </w:r>
       <w:r>
-        <w:t xml:space="preserve"> </w:t>
-      </w:r>
-      <w:r>
-        <w:t xml:space="preserve">Nüüd mainitakse lühendite ja mõistete sõnastiku </w:t>
+        <w:t xml:space="preserve"> Nüüd mainitakse lühendite ja mõistete sõnastiku </w:t>
       </w:r>
       <w:r>
         <w:t>kolmandat</w:t>
       </w:r>
       <w:r>
-        <w:t xml:space="preserve"> mõistet </w:t>
-      </w:r>
-      <w:r>
-        <w:t>DPI</w:t>
-      </w:r>
-      <w:r>
-        <w:t xml:space="preserve"> (</w:t>
+        <w:t xml:space="preserve"> mõistet DPI (</w:t>
       </w:r>
       <w:r>
         <w:rPr>
@@ -5397,44 +5388,39 @@
         <w:t xml:space="preserve">Nüüd mainitakse lühendite ja mõistete sõnastiku teist mõistet </w:t>
       </w:r>
       <w:r>
-        <w:t>IA</w:t>
-      </w:r>
-      <w:r>
-        <w:t xml:space="preserve"> </w:t>
+        <w:t xml:space="preserve">IA </w:t>
       </w:r>
       <w:r>
         <w:lastRenderedPageBreak/>
-        <w:t>(</w:t>
-      </w:r>
-      <w:r>
-        <w:t>Arvutisüsteemide instituut</w:t>
-      </w:r>
-      <w:r>
-        <w:t>).</w:t>
-      </w:r>
-      <w:r>
-        <w:t xml:space="preserve"> </w:t>
+        <w:t xml:space="preserve">(Arvutisüsteemide instituut). </w:t>
       </w:r>
       <w:r>
         <w:t>Erinevad vormistuselemendid, sealhulgas pealkirjad, lõigud ja tabelid, on paigutatud dokumenti selliselt, et valideerimisreeglite kontrollimiseks oleks piisavalt materjali. Testimise käigus kontrollitakse nii vormistuse kui ka struktuuri vastavust nõuetele.</w:t>
       </w:r>
-      <w:r>
-        <w:t xml:space="preserve"> </w:t>
-      </w:r>
-      <w:r>
-        <w:t xml:space="preserve">Järgnevalt illustreeritakse </w:t>
-      </w:r>
-      <w:r>
-        <w:t>tabelitega</w:t>
-      </w:r>
-      <w:r>
-        <w:t xml:space="preserve"> seotud valideerimisreeglite toimimist </w:t>
-      </w:r>
-      <w:r>
-        <w:t>Tabeliga</w:t>
-      </w:r>
-      <w:r>
-        <w:t xml:space="preserve"> 1.</w:t>
+    </w:p>
+    <w:p>
+      <w:pPr>
+        <w:pStyle w:val="Heading2"/>
+      </w:pPr>
+      <w:r>
+        <w:t>Alap</w:t>
+      </w:r>
+      <w:r>
+        <w:t>eatük</w:t>
+      </w:r>
+      <w:r>
+        <w:t>k</w:t>
+      </w:r>
+    </w:p>
+    <w:p>
+      <w:r>
+        <w:t>Käesolev lõik on näidistekst, mida kasutatakse dokumendi vormistuse testimiseks. Tekst ei oma sisulist tähendust ning on koostatud üksnes vormistusnõuete kontrollimise eesmärgil. Lõigu pikkus on valitud selliselt, et see vastaks tüüpilise akadeemilise teksti mahule.</w:t>
+      </w:r>
+      <w:r>
+        <w:t xml:space="preserve"> </w:t>
+      </w:r>
+      <w:r>
+        <w:t>Järgnevalt illustreeritakse tabelitega seotud valideerimisreeglite toimimist Tabeliga 1.</w:t>
       </w:r>
     </w:p>
     <w:p>
@@ -5512,14 +5498,7 @@
                 <w:b/>
                 <w:bCs/>
               </w:rPr>
-              <w:t xml:space="preserve">Tabeli veerg </w:t>
-            </w:r>
-            <w:r>
-              <w:rPr>
-                <w:b/>
-                <w:bCs/>
-              </w:rPr>
-              <w:t>2</w:t>
+              <w:t>Tabeli veerg 2</w:t>
             </w:r>
           </w:p>
         </w:tc>
@@ -5540,14 +5519,7 @@
                 <w:b/>
                 <w:bCs/>
               </w:rPr>
-              <w:t xml:space="preserve">Tabeli veerg </w:t>
-            </w:r>
-            <w:r>
-              <w:rPr>
-                <w:b/>
-                <w:bCs/>
-              </w:rPr>
-              <w:t>3</w:t>
+              <w:t>Tabeli veerg 3</w:t>
             </w:r>
           </w:p>
         </w:tc>
@@ -5635,54 +5607,31 @@
         </w:tc>
       </w:tr>
     </w:tbl>
-    <w:p/>
+    <w:p>
+      <w:pPr>
+        <w:pStyle w:val="Heading3"/>
+      </w:pPr>
+      <w:bookmarkStart w:id="6" w:name="_Toc227257309"/>
+      <w:r>
+        <w:t>Alapeat</w:t>
+      </w:r>
+      <w:r>
+        <w:t xml:space="preserve">üki </w:t>
+      </w:r>
+      <w:r>
+        <w:t>alapeatükk</w:t>
+      </w:r>
+      <w:bookmarkEnd w:id="6"/>
+    </w:p>
     <w:p>
       <w:r>
         <w:t>Käesolev lõik on näidistekst, mida kasutatakse dokumendi vormistuse testimiseks. Tekst ei oma sisulist tähendust ning on koostatud üksnes vormistusnõuete kontrollimise eesmärgil. Lõigu pikkus on valitud selliselt, et see vastaks tüüpilise akadeemilise teksti mahule.</w:t>
       </w:r>
-    </w:p>
-    <w:p>
-      <w:r>
-        <w:t>Järgnevas lõigus käsitletakse täiendavaid aspekte, mis on vajalikud testimise läbiviimiseks. Erinevad vormistuselemendid, sealhulgas pealkirjad, lõigud ja tabelid, on paigutatud dokumenti selliselt, et valideerimisreeglite kontrollimiseks oleks piisavalt materjali. Testimise käigus kontrollitakse nii vormistuse kui ka struktuuri vastavust nõuetele.</w:t>
-      </w:r>
-    </w:p>
-    <w:p>
-      <w:pPr>
-        <w:pStyle w:val="Heading3"/>
-      </w:pPr>
-      <w:bookmarkStart w:id="6" w:name="_Toc227257309"/>
-      <w:r>
-        <w:t>Alapeat</w:t>
-      </w:r>
-      <w:r>
-        <w:t xml:space="preserve">üki </w:t>
-      </w:r>
-      <w:r>
-        <w:t>alapeatükk</w:t>
-      </w:r>
-      <w:bookmarkEnd w:id="6"/>
-    </w:p>
-    <w:p>
-      <w:r>
-        <w:t>Käesolev lõik on näidistekst, mida kasutatakse dokumendi vormistuse testimiseks. Tekst ei oma sisulist tähendust ning on koostatud üksnes vormistusnõuete kontrollimise eesmärgil. Lõigu pikkus on valitud selliselt, et see vastaks tüüpilise akadeemilise teksti mahule.</w:t>
-      </w:r>
-      <w:r>
-        <w:t xml:space="preserve"> </w:t>
-      </w:r>
-      <w:r>
-        <w:t>Järgnevalt illustreeritakse</w:t>
-      </w:r>
-      <w:r>
-        <w:t xml:space="preserve"> programmikoodiga</w:t>
-      </w:r>
-      <w:r>
-        <w:t xml:space="preserve"> seotud valideerimisreeglite toimimist Joonisega </w:t>
-      </w:r>
-      <w:r>
-        <w:t>2</w:t>
-      </w:r>
-      <w:r>
-        <w:t>.</w:t>
+      <w:r>
+        <w:t xml:space="preserve"> </w:t>
+      </w:r>
+      <w:r>
+        <w:t>Järgnevalt illustreeritakse programmikoodiga seotud valideerimisreeglite toimimist Joonisega 2.</w:t>
       </w:r>
     </w:p>
     <w:p>
@@ -6063,19 +6012,27 @@
     </w:p>
     <w:p>
       <w:r>
+        <w:t>Käesolev lõik on näidistekst, mida kasutatakse dokumendi vormistuse testimiseks. Tekst ei oma sisulist tähendust ning on koostatud üksnes vormistusnõuete kontrollimise eesmärgil. Lõigu pikkus on valitud selliselt, et see vastaks tüüpilise akadeemilise teksti mahule.</w:t>
+      </w:r>
+    </w:p>
+    <w:p>
+      <w:pPr>
+        <w:pStyle w:val="Heading3"/>
+      </w:pPr>
+      <w:r>
         <w:lastRenderedPageBreak/>
-        <w:t>Käesolev lõik on näidistekst, mida kasutatakse dokumendi vormistuse testimiseks. Tekst ei oma sisulist tähendust ning on koostatud üksnes vormistusnõuete kontrollimise eesmärgil. Lõigu pikkus on valitud selliselt, et see vastaks tüüpilise akadeemilise teksti mahule.</w:t>
-      </w:r>
-    </w:p>
-    <w:p>
-      <w:r>
-        <w:t xml:space="preserve">Järgnevas lõigus käsitletakse täiendavaid aspekte, mis on vajalikud testimise läbiviimiseks. Erinevad vormistuselemendid, sealhulgas pealkirjad, lõigud ja tabelid, on paigutatud dokumenti selliselt, et valideerimisreeglite kontrollimiseks oleks piisavalt materjali. Testimise käigus kontrollitakse nii vormistuse kui ka struktuuri vastavust nõuetele. Järgnevalt illustreeritakse programmikoodiga seotud valideerimisreeglite toimimist Joonisega </w:t>
-      </w:r>
-      <w:r>
-        <w:t>3</w:t>
-      </w:r>
-      <w:r>
-        <w:t>.</w:t>
+        <w:t>Alapeat</w:t>
+      </w:r>
+      <w:r>
+        <w:t xml:space="preserve">üki </w:t>
+      </w:r>
+      <w:r>
+        <w:t>alapeatükk</w:t>
+      </w:r>
+    </w:p>
+    <w:p>
+      <w:r>
+        <w:t>Järgnevas lõigus käsitletakse täiendavaid aspekte, mis on vajalikud testimise läbiviimiseks. Erinevad vormistuselemendid, sealhulgas pealkirjad, lõigud ja tabelid, on paigutatud dokumenti selliselt, et valideerimisreeglite kontrollimiseks oleks piisavalt materjali. Testimise käigus kontrollitakse nii vormistuse kui ka struktuuri vastavust nõuetele. Järgnevalt illustreeritakse programmikoodiga seotud valideerimisreeglite toimimist Joonisega 3.</w:t>
       </w:r>
     </w:p>
     <w:p>

</xml_diff>

<commit_message>
improve margin rule check, add test cases and add details to failed ruled
</commit_message>
<xml_diff>
--- a/docs/test-documents/thesis-validator-test-correct.docx
+++ b/docs/test-documents/thesis-validator-test-correct.docx
@@ -478,7 +478,7 @@
         <w:sectPr>
           <w:footerReference w:type="default" r:id="rId8"/>
           <w:pgSz w:w="11906" w:h="16838"/>
-          <w:pgMar w:top="1417" w:right="1417" w:bottom="1417" w:left="1417" w:header="708" w:footer="850" w:gutter="0"/>
+          <w:pgMar w:top="1442" w:right="1676" w:bottom="1393" w:left="1725" w:header="709" w:footer="851" w:gutter="0"/>
           <w:cols w:space="708"/>
           <w:docGrid w:linePitch="360"/>
         </w:sectPr>
@@ -518,9 +518,8 @@
         <w:jc w:val="left"/>
         <w:sectPr>
           <w:footerReference w:type="default" r:id="rId9"/>
-          <w:type w:val="continuous"/>
           <w:pgSz w:w="11906" w:h="16838"/>
-          <w:pgMar w:top="1418" w:right="1701" w:bottom="1418" w:left="1701" w:header="709" w:footer="850" w:gutter="0"/>
+          <w:pgMar w:top="1418" w:right="1701" w:bottom="1418" w:left="1701" w:header="709" w:footer="851" w:gutter="0"/>
           <w:cols w:space="708"/>
           <w:docGrid w:linePitch="360"/>
         </w:sectPr>
@@ -587,7 +586,7 @@
         <w:jc w:val="left"/>
         <w:sectPr>
           <w:pgSz w:w="11906" w:h="16838"/>
-          <w:pgMar w:top="1418" w:right="1701" w:bottom="1418" w:left="1701" w:header="709" w:footer="850" w:gutter="0"/>
+          <w:pgMar w:top="1418" w:right="1701" w:bottom="1418" w:left="1701" w:header="709" w:footer="851" w:gutter="0"/>
           <w:cols w:space="708"/>
           <w:docGrid w:linePitch="360"/>
         </w:sectPr>
@@ -3630,7 +3629,7 @@
         </w:rPr>
         <w:sectPr>
           <w:pgSz w:w="11906" w:h="16838"/>
-          <w:pgMar w:top="1418" w:right="1701" w:bottom="1418" w:left="1701" w:header="709" w:footer="850" w:gutter="0"/>
+          <w:pgMar w:top="1418" w:right="1701" w:bottom="1418" w:left="1701" w:header="709" w:footer="851" w:gutter="0"/>
           <w:cols w:space="708"/>
           <w:docGrid w:linePitch="360"/>
         </w:sectPr>
@@ -3892,7 +3891,7 @@
         <w:jc w:val="left"/>
         <w:sectPr>
           <w:pgSz w:w="11906" w:h="16838"/>
-          <w:pgMar w:top="1418" w:right="1701" w:bottom="1418" w:left="1701" w:header="709" w:footer="850" w:gutter="0"/>
+          <w:pgMar w:top="1418" w:right="1701" w:bottom="1418" w:left="1701" w:header="709" w:footer="851" w:gutter="0"/>
           <w:cols w:space="708"/>
           <w:docGrid w:linePitch="360"/>
         </w:sectPr>
@@ -4759,7 +4758,7 @@
         <w:jc w:val="left"/>
         <w:sectPr>
           <w:pgSz w:w="11906" w:h="16838"/>
-          <w:pgMar w:top="1418" w:right="1701" w:bottom="1418" w:left="1701" w:header="709" w:footer="850" w:gutter="0"/>
+          <w:pgMar w:top="1418" w:right="1701" w:bottom="1418" w:left="1701" w:header="709" w:footer="851" w:gutter="0"/>
           <w:cols w:space="708"/>
           <w:docGrid w:linePitch="360"/>
         </w:sectPr>
@@ -5010,7 +5009,7 @@
         <w:jc w:val="left"/>
         <w:sectPr>
           <w:pgSz w:w="11906" w:h="16838"/>
-          <w:pgMar w:top="1418" w:right="1701" w:bottom="1418" w:left="1701" w:header="709" w:footer="850" w:gutter="0"/>
+          <w:pgMar w:top="1418" w:right="1701" w:bottom="1418" w:left="1701" w:header="709" w:footer="851" w:gutter="0"/>
           <w:cols w:space="708"/>
           <w:docGrid w:linePitch="360"/>
         </w:sectPr>
@@ -5117,7 +5116,7 @@
         <w:jc w:val="left"/>
         <w:sectPr>
           <w:pgSz w:w="11906" w:h="16838"/>
-          <w:pgMar w:top="1418" w:right="1701" w:bottom="1418" w:left="1701" w:header="709" w:footer="850" w:gutter="0"/>
+          <w:pgMar w:top="1418" w:right="1701" w:bottom="1418" w:left="1701" w:header="709" w:footer="851" w:gutter="0"/>
           <w:cols w:space="708"/>
           <w:docGrid w:linePitch="360"/>
         </w:sectPr>
@@ -5190,7 +5189,7 @@
       <w:pPr>
         <w:sectPr>
           <w:pgSz w:w="11906" w:h="16838"/>
-          <w:pgMar w:top="1418" w:right="1701" w:bottom="1418" w:left="1701" w:header="709" w:footer="850" w:gutter="0"/>
+          <w:pgMar w:top="1418" w:right="1701" w:bottom="1418" w:left="1701" w:header="709" w:footer="851" w:gutter="0"/>
           <w:cols w:space="708"/>
           <w:docGrid w:linePitch="360"/>
         </w:sectPr>
@@ -5414,13 +5413,7 @@
     </w:p>
     <w:p>
       <w:r>
-        <w:t>Käesolev lõik on näidistekst, mida kasutatakse dokumendi vormistuse testimiseks. Tekst ei oma sisulist tähendust ning on koostatud üksnes vormistusnõuete kontrollimise eesmärgil. Lõigu pikkus on valitud selliselt, et see vastaks tüüpilise akadeemilise teksti mahule.</w:t>
-      </w:r>
-      <w:r>
-        <w:t xml:space="preserve"> </w:t>
-      </w:r>
-      <w:r>
-        <w:t>Järgnevalt illustreeritakse tabelitega seotud valideerimisreeglite toimimist Tabeliga 1.</w:t>
+        <w:t>Käesolev lõik on näidistekst, mida kasutatakse dokumendi vormistuse testimiseks. Tekst ei oma sisulist tähendust ning on koostatud üksnes vormistusnõuete kontrollimise eesmärgil. Lõigu pikkus on valitud selliselt, et see vastaks tüüpilise akadeemilise teksti mahule. Järgnevalt illustreeritakse tabelitega seotud valideerimisreeglite toimimist Tabeliga 1.</w:t>
       </w:r>
     </w:p>
     <w:p>
@@ -6413,7 +6406,7 @@
       <w:pPr>
         <w:sectPr>
           <w:pgSz w:w="11906" w:h="16838"/>
-          <w:pgMar w:top="1418" w:right="1701" w:bottom="1418" w:left="1701" w:header="709" w:footer="850" w:gutter="0"/>
+          <w:pgMar w:top="1418" w:right="1701" w:bottom="1418" w:left="1701" w:header="709" w:footer="851" w:gutter="0"/>
           <w:cols w:space="708"/>
           <w:docGrid w:linePitch="360"/>
         </w:sectPr>
@@ -7330,7 +7323,7 @@
       <w:pPr>
         <w:sectPr>
           <w:pgSz w:w="11906" w:h="16838"/>
-          <w:pgMar w:top="1418" w:right="1701" w:bottom="1418" w:left="1701" w:header="709" w:footer="850" w:gutter="0"/>
+          <w:pgMar w:top="1418" w:right="1701" w:bottom="1418" w:left="1701" w:header="709" w:footer="851" w:gutter="0"/>
           <w:cols w:space="708"/>
           <w:docGrid w:linePitch="360"/>
         </w:sectPr>
@@ -7380,7 +7373,7 @@
       <w:pPr>
         <w:sectPr>
           <w:pgSz w:w="11906" w:h="16838"/>
-          <w:pgMar w:top="1418" w:right="1701" w:bottom="1418" w:left="1701" w:header="709" w:footer="850" w:gutter="0"/>
+          <w:pgMar w:top="1418" w:right="1701" w:bottom="1418" w:left="1701" w:header="709" w:footer="851" w:gutter="0"/>
           <w:cols w:space="708"/>
           <w:docGrid w:linePitch="360"/>
         </w:sectPr>
@@ -7418,7 +7411,7 @@
         <w:jc w:val="left"/>
         <w:sectPr>
           <w:pgSz w:w="11906" w:h="16838"/>
-          <w:pgMar w:top="1418" w:right="1701" w:bottom="1418" w:left="1701" w:header="709" w:footer="850" w:gutter="0"/>
+          <w:pgMar w:top="1418" w:right="1701" w:bottom="1418" w:left="1701" w:header="709" w:footer="851" w:gutter="0"/>
           <w:cols w:space="708"/>
           <w:docGrid w:linePitch="360"/>
         </w:sectPr>
@@ -7583,7 +7576,7 @@
         <w:jc w:val="left"/>
         <w:sectPr>
           <w:pgSz w:w="11906" w:h="16838"/>
-          <w:pgMar w:top="1418" w:right="1701" w:bottom="1418" w:left="1701" w:header="709" w:footer="850" w:gutter="0"/>
+          <w:pgMar w:top="1418" w:right="1701" w:bottom="1418" w:left="1701" w:header="709" w:footer="851" w:gutter="0"/>
           <w:cols w:space="708"/>
           <w:docGrid w:linePitch="360"/>
         </w:sectPr>
@@ -7613,7 +7606,7 @@
         <w:pStyle w:val="BodyText"/>
         <w:sectPr>
           <w:pgSz w:w="11906" w:h="16838"/>
-          <w:pgMar w:top="1418" w:right="1701" w:bottom="1418" w:left="1701" w:header="709" w:footer="850" w:gutter="0"/>
+          <w:pgMar w:top="1418" w:right="1701" w:bottom="1418" w:left="1701" w:header="709" w:footer="851" w:gutter="0"/>
           <w:cols w:space="708"/>
           <w:docGrid w:linePitch="360"/>
         </w:sectPr>
@@ -7799,7 +7792,7 @@
     </w:p>
     <w:sectPr>
       <w:pgSz w:w="11906" w:h="16838"/>
-      <w:pgMar w:top="1418" w:right="1701" w:bottom="1418" w:left="1701" w:header="709" w:footer="850" w:gutter="0"/>
+      <w:pgMar w:top="1418" w:right="1701" w:bottom="1418" w:left="1701" w:header="709" w:footer="851" w:gutter="0"/>
       <w:cols w:space="708"/>
       <w:docGrid w:linePitch="360"/>
     </w:sectPr>

</xml_diff>

<commit_message>
fix IDs and add ruleName
</commit_message>
<xml_diff>
--- a/docs/test-documents/thesis-validator-test-correct.docx
+++ b/docs/test-documents/thesis-validator-test-correct.docx
@@ -478,7 +478,7 @@
         <w:sectPr>
           <w:footerReference w:type="default" r:id="rId8"/>
           <w:pgSz w:w="11906" w:h="16838"/>
-          <w:pgMar w:top="1442" w:right="1676" w:bottom="1393" w:left="1725" w:header="709" w:footer="851" w:gutter="0"/>
+          <w:pgMar w:top="1440" w:right="1678" w:bottom="1395" w:left="1724" w:header="709" w:footer="851" w:gutter="0"/>
           <w:cols w:space="708"/>
           <w:docGrid w:linePitch="360"/>
         </w:sectPr>
@@ -519,7 +519,7 @@
         <w:sectPr>
           <w:footerReference w:type="default" r:id="rId9"/>
           <w:pgSz w:w="11906" w:h="16838"/>
-          <w:pgMar w:top="1418" w:right="1701" w:bottom="1418" w:left="1701" w:header="709" w:footer="851" w:gutter="0"/>
+          <w:pgMar w:top="1440" w:right="1678" w:bottom="1395" w:left="1724" w:header="709" w:footer="828" w:gutter="0"/>
           <w:cols w:space="708"/>
           <w:docGrid w:linePitch="360"/>
         </w:sectPr>
@@ -586,7 +586,7 @@
         <w:jc w:val="left"/>
         <w:sectPr>
           <w:pgSz w:w="11906" w:h="16838"/>
-          <w:pgMar w:top="1418" w:right="1701" w:bottom="1418" w:left="1701" w:header="709" w:footer="851" w:gutter="0"/>
+          <w:pgMar w:top="1440" w:right="1678" w:bottom="1395" w:left="1724" w:header="709" w:footer="867" w:gutter="0"/>
           <w:cols w:space="708"/>
           <w:docGrid w:linePitch="360"/>
         </w:sectPr>
@@ -3529,14 +3529,12 @@
         </w:rPr>
         <w:t xml:space="preserve"> pages of </w:t>
       </w:r>
-      <w:proofErr w:type="spellStart"/>
-      <w:r>
-        <w:rPr>
-          <w:bCs/>
-        </w:rPr>
-        <w:t>text</w:t>
-      </w:r>
-      <w:proofErr w:type="spellEnd"/>
+      <w:r>
+        <w:rPr>
+          <w:bCs/>
+        </w:rPr>
+        <w:t>test</w:t>
+      </w:r>
       <w:r>
         <w:rPr>
           <w:bCs/>
@@ -3629,7 +3627,7 @@
         </w:rPr>
         <w:sectPr>
           <w:pgSz w:w="11906" w:h="16838"/>
-          <w:pgMar w:top="1418" w:right="1701" w:bottom="1418" w:left="1701" w:header="709" w:footer="851" w:gutter="0"/>
+          <w:pgMar w:top="1440" w:right="1678" w:bottom="1395" w:left="1724" w:header="709" w:footer="851" w:gutter="0"/>
           <w:cols w:space="708"/>
           <w:docGrid w:linePitch="360"/>
         </w:sectPr>
@@ -3891,7 +3889,7 @@
         <w:jc w:val="left"/>
         <w:sectPr>
           <w:pgSz w:w="11906" w:h="16838"/>
-          <w:pgMar w:top="1418" w:right="1701" w:bottom="1418" w:left="1701" w:header="709" w:footer="851" w:gutter="0"/>
+          <w:pgMar w:top="1440" w:right="1678" w:bottom="1395" w:left="1724" w:header="709" w:footer="851" w:gutter="0"/>
           <w:cols w:space="708"/>
           <w:docGrid w:linePitch="360"/>
         </w:sectPr>
@@ -4758,7 +4756,7 @@
         <w:jc w:val="left"/>
         <w:sectPr>
           <w:pgSz w:w="11906" w:h="16838"/>
-          <w:pgMar w:top="1418" w:right="1701" w:bottom="1418" w:left="1701" w:header="709" w:footer="851" w:gutter="0"/>
+          <w:pgMar w:top="1440" w:right="1678" w:bottom="1395" w:left="1724" w:header="709" w:footer="851" w:gutter="0"/>
           <w:cols w:space="708"/>
           <w:docGrid w:linePitch="360"/>
         </w:sectPr>
@@ -5009,7 +5007,7 @@
         <w:jc w:val="left"/>
         <w:sectPr>
           <w:pgSz w:w="11906" w:h="16838"/>
-          <w:pgMar w:top="1418" w:right="1701" w:bottom="1418" w:left="1701" w:header="709" w:footer="851" w:gutter="0"/>
+          <w:pgMar w:top="1440" w:right="1678" w:bottom="1395" w:left="1724" w:header="709" w:footer="851" w:gutter="0"/>
           <w:cols w:space="708"/>
           <w:docGrid w:linePitch="360"/>
         </w:sectPr>
@@ -5116,7 +5114,7 @@
         <w:jc w:val="left"/>
         <w:sectPr>
           <w:pgSz w:w="11906" w:h="16838"/>
-          <w:pgMar w:top="1418" w:right="1701" w:bottom="1418" w:left="1701" w:header="709" w:footer="851" w:gutter="0"/>
+          <w:pgMar w:top="1440" w:right="1678" w:bottom="1395" w:left="1724" w:header="709" w:footer="851" w:gutter="0"/>
           <w:cols w:space="708"/>
           <w:docGrid w:linePitch="360"/>
         </w:sectPr>
@@ -5189,7 +5187,7 @@
       <w:pPr>
         <w:sectPr>
           <w:pgSz w:w="11906" w:h="16838"/>
-          <w:pgMar w:top="1418" w:right="1701" w:bottom="1418" w:left="1701" w:header="709" w:footer="851" w:gutter="0"/>
+          <w:pgMar w:top="1440" w:right="1678" w:bottom="1395" w:left="1724" w:header="709" w:footer="851" w:gutter="0"/>
           <w:cols w:space="708"/>
           <w:docGrid w:linePitch="360"/>
         </w:sectPr>
@@ -6406,7 +6404,7 @@
       <w:pPr>
         <w:sectPr>
           <w:pgSz w:w="11906" w:h="16838"/>
-          <w:pgMar w:top="1418" w:right="1701" w:bottom="1418" w:left="1701" w:header="709" w:footer="851" w:gutter="0"/>
+          <w:pgMar w:top="1440" w:right="1678" w:bottom="1395" w:left="1724" w:header="709" w:footer="851" w:gutter="0"/>
           <w:cols w:space="708"/>
           <w:docGrid w:linePitch="360"/>
         </w:sectPr>
@@ -7323,7 +7321,7 @@
       <w:pPr>
         <w:sectPr>
           <w:pgSz w:w="11906" w:h="16838"/>
-          <w:pgMar w:top="1418" w:right="1701" w:bottom="1418" w:left="1701" w:header="709" w:footer="851" w:gutter="0"/>
+          <w:pgMar w:top="1440" w:right="1678" w:bottom="1395" w:left="1724" w:header="709" w:footer="851" w:gutter="0"/>
           <w:cols w:space="708"/>
           <w:docGrid w:linePitch="360"/>
         </w:sectPr>
@@ -7373,7 +7371,7 @@
       <w:pPr>
         <w:sectPr>
           <w:pgSz w:w="11906" w:h="16838"/>
-          <w:pgMar w:top="1418" w:right="1701" w:bottom="1418" w:left="1701" w:header="709" w:footer="851" w:gutter="0"/>
+          <w:pgMar w:top="1440" w:right="1678" w:bottom="1395" w:left="1724" w:header="709" w:footer="851" w:gutter="0"/>
           <w:cols w:space="708"/>
           <w:docGrid w:linePitch="360"/>
         </w:sectPr>
@@ -7411,7 +7409,7 @@
         <w:jc w:val="left"/>
         <w:sectPr>
           <w:pgSz w:w="11906" w:h="16838"/>
-          <w:pgMar w:top="1418" w:right="1701" w:bottom="1418" w:left="1701" w:header="709" w:footer="851" w:gutter="0"/>
+          <w:pgMar w:top="1440" w:right="1678" w:bottom="1395" w:left="1724" w:header="709" w:footer="851" w:gutter="0"/>
           <w:cols w:space="708"/>
           <w:docGrid w:linePitch="360"/>
         </w:sectPr>
@@ -7576,7 +7574,7 @@
         <w:jc w:val="left"/>
         <w:sectPr>
           <w:pgSz w:w="11906" w:h="16838"/>
-          <w:pgMar w:top="1418" w:right="1701" w:bottom="1418" w:left="1701" w:header="709" w:footer="851" w:gutter="0"/>
+          <w:pgMar w:top="1440" w:right="1678" w:bottom="1395" w:left="1724" w:header="709" w:footer="851" w:gutter="0"/>
           <w:cols w:space="708"/>
           <w:docGrid w:linePitch="360"/>
         </w:sectPr>
@@ -7606,7 +7604,7 @@
         <w:pStyle w:val="BodyText"/>
         <w:sectPr>
           <w:pgSz w:w="11906" w:h="16838"/>
-          <w:pgMar w:top="1418" w:right="1701" w:bottom="1418" w:left="1701" w:header="709" w:footer="851" w:gutter="0"/>
+          <w:pgMar w:top="1440" w:right="1678" w:bottom="1395" w:left="1724" w:header="709" w:footer="851" w:gutter="0"/>
           <w:cols w:space="708"/>
           <w:docGrid w:linePitch="360"/>
         </w:sectPr>
@@ -7792,7 +7790,7 @@
     </w:p>
     <w:sectPr>
       <w:pgSz w:w="11906" w:h="16838"/>
-      <w:pgMar w:top="1418" w:right="1701" w:bottom="1418" w:left="1701" w:header="709" w:footer="851" w:gutter="0"/>
+      <w:pgMar w:top="1440" w:right="1678" w:bottom="1395" w:left="1724" w:header="709" w:footer="851" w:gutter="0"/>
       <w:cols w:space="708"/>
       <w:docGrid w:linePitch="360"/>
     </w:sectPr>

</xml_diff>

<commit_message>
update font size rule validation and test cases
</commit_message>
<xml_diff>
--- a/docs/test-documents/thesis-validator-test-correct.docx
+++ b/docs/test-documents/thesis-validator-test-correct.docx
@@ -487,8 +487,16 @@
     <w:p>
       <w:pPr>
         <w:pStyle w:val="Heading"/>
-      </w:pPr>
-      <w:r>
+        <w:rPr>
+          <w:sz w:val="32"/>
+          <w:szCs w:val="32"/>
+        </w:rPr>
+      </w:pPr>
+      <w:r>
+        <w:rPr>
+          <w:sz w:val="32"/>
+          <w:szCs w:val="32"/>
+        </w:rPr>
         <w:lastRenderedPageBreak/>
         <w:t>Autorideklaratsioon</w:t>
       </w:r>
@@ -528,8 +536,16 @@
     <w:p>
       <w:pPr>
         <w:pStyle w:val="Heading"/>
-      </w:pPr>
-      <w:r>
+        <w:rPr>
+          <w:sz w:val="32"/>
+          <w:szCs w:val="32"/>
+        </w:rPr>
+      </w:pPr>
+      <w:r>
+        <w:rPr>
+          <w:sz w:val="32"/>
+          <w:szCs w:val="32"/>
+        </w:rPr>
         <w:lastRenderedPageBreak/>
         <w:t>Lühikokkuvõte</w:t>
       </w:r>
@@ -595,9 +611,17 @@
     <w:p>
       <w:pPr>
         <w:pStyle w:val="Heading"/>
-      </w:pPr>
-      <w:proofErr w:type="spellStart"/>
-      <w:r>
+        <w:rPr>
+          <w:sz w:val="32"/>
+          <w:szCs w:val="32"/>
+        </w:rPr>
+      </w:pPr>
+      <w:proofErr w:type="spellStart"/>
+      <w:r>
+        <w:rPr>
+          <w:sz w:val="32"/>
+          <w:szCs w:val="32"/>
+        </w:rPr>
         <w:lastRenderedPageBreak/>
         <w:t>Abstract</w:t>
       </w:r>
@@ -3636,8 +3660,16 @@
     <w:p>
       <w:pPr>
         <w:pStyle w:val="Heading"/>
-      </w:pPr>
-      <w:r>
+        <w:rPr>
+          <w:sz w:val="32"/>
+          <w:szCs w:val="32"/>
+        </w:rPr>
+      </w:pPr>
+      <w:r>
+        <w:rPr>
+          <w:sz w:val="32"/>
+          <w:szCs w:val="32"/>
+        </w:rPr>
         <w:lastRenderedPageBreak/>
         <w:t>Lühendite ja mõistete sõnastik</w:t>
       </w:r>
@@ -3898,8 +3930,16 @@
     <w:p>
       <w:pPr>
         <w:pStyle w:val="Heading"/>
-      </w:pPr>
-      <w:r>
+        <w:rPr>
+          <w:sz w:val="32"/>
+          <w:szCs w:val="32"/>
+        </w:rPr>
+      </w:pPr>
+      <w:r>
+        <w:rPr>
+          <w:sz w:val="32"/>
+          <w:szCs w:val="32"/>
+        </w:rPr>
         <w:lastRenderedPageBreak/>
         <w:t>Sisukord</w:t>
       </w:r>
@@ -3942,7 +3982,7 @@
         </w:rPr>
         <w:fldChar w:fldCharType="separate"/>
       </w:r>
-      <w:hyperlink w:anchor="_Toc227257306" w:history="1">
+      <w:hyperlink w:anchor="_Toc228477431" w:history="1">
         <w:r>
           <w:rPr>
             <w:rStyle w:val="Hyperlink"/>
@@ -3986,7 +4026,7 @@
             <w:noProof/>
             <w:webHidden/>
           </w:rPr>
-          <w:instrText xml:space="preserve"> PAGEREF _Toc227257306 \h </w:instrText>
+          <w:instrText xml:space="preserve"> PAGEREF _Toc228477431 \h </w:instrText>
         </w:r>
         <w:r>
           <w:rPr>
@@ -4031,7 +4071,7 @@
           <w14:ligatures w14:val="standardContextual"/>
         </w:rPr>
       </w:pPr>
-      <w:hyperlink w:anchor="_Toc227257307" w:history="1">
+      <w:hyperlink w:anchor="_Toc228477432" w:history="1">
         <w:r>
           <w:rPr>
             <w:rStyle w:val="Hyperlink"/>
@@ -4075,7 +4115,7 @@
             <w:noProof/>
             <w:webHidden/>
           </w:rPr>
-          <w:instrText xml:space="preserve"> PAGEREF _Toc227257307 \h </w:instrText>
+          <w:instrText xml:space="preserve"> PAGEREF _Toc228477432 \h </w:instrText>
         </w:r>
         <w:r>
           <w:rPr>
@@ -4121,7 +4161,7 @@
           <w14:ligatures w14:val="standardContextual"/>
         </w:rPr>
       </w:pPr>
-      <w:hyperlink w:anchor="_Toc227257308" w:history="1">
+      <w:hyperlink w:anchor="_Toc228477433" w:history="1">
         <w:r>
           <w:rPr>
             <w:rStyle w:val="Hyperlink"/>
@@ -4165,7 +4205,7 @@
             <w:noProof/>
             <w:webHidden/>
           </w:rPr>
-          <w:instrText xml:space="preserve"> PAGEREF _Toc227257308 \h </w:instrText>
+          <w:instrText xml:space="preserve"> PAGEREF _Toc228477433 \h </w:instrText>
         </w:r>
         <w:r>
           <w:rPr>
@@ -4186,6 +4226,96 @@
             <w:webHidden/>
           </w:rPr>
           <w:t>10</w:t>
+        </w:r>
+        <w:r>
+          <w:rPr>
+            <w:noProof/>
+            <w:webHidden/>
+          </w:rPr>
+          <w:fldChar w:fldCharType="end"/>
+        </w:r>
+      </w:hyperlink>
+    </w:p>
+    <w:p>
+      <w:pPr>
+        <w:pStyle w:val="TOC2"/>
+        <w:tabs>
+          <w:tab w:val="left" w:pos="960"/>
+          <w:tab w:val="right" w:leader="dot" w:pos="8494"/>
+        </w:tabs>
+        <w:rPr>
+          <w:rFonts w:asciiTheme="minorHAnsi" w:eastAsiaTheme="minorEastAsia" w:hAnsiTheme="minorHAnsi" w:cstheme="minorBidi"/>
+          <w:noProof/>
+          <w:kern w:val="2"/>
+          <w:lang w:val="en-EE" w:eastAsia="en-GB"/>
+          <w14:ligatures w14:val="standardContextual"/>
+        </w:rPr>
+      </w:pPr>
+      <w:hyperlink w:anchor="_Toc228477434" w:history="1">
+        <w:r>
+          <w:rPr>
+            <w:rStyle w:val="Hyperlink"/>
+            <w:noProof/>
+          </w:rPr>
+          <w:t>2.2</w:t>
+        </w:r>
+        <w:r>
+          <w:rPr>
+            <w:rFonts w:asciiTheme="minorHAnsi" w:eastAsiaTheme="minorEastAsia" w:hAnsiTheme="minorHAnsi" w:cstheme="minorBidi"/>
+            <w:noProof/>
+            <w:kern w:val="2"/>
+            <w:lang w:val="en-EE" w:eastAsia="en-GB"/>
+            <w14:ligatures w14:val="standardContextual"/>
+          </w:rPr>
+          <w:tab/>
+        </w:r>
+        <w:r>
+          <w:rPr>
+            <w:rStyle w:val="Hyperlink"/>
+            <w:noProof/>
+          </w:rPr>
+          <w:t>Alapeatükk</w:t>
+        </w:r>
+        <w:r>
+          <w:rPr>
+            <w:noProof/>
+            <w:webHidden/>
+          </w:rPr>
+          <w:tab/>
+        </w:r>
+        <w:r>
+          <w:rPr>
+            <w:noProof/>
+            <w:webHidden/>
+          </w:rPr>
+          <w:fldChar w:fldCharType="begin"/>
+        </w:r>
+        <w:r>
+          <w:rPr>
+            <w:noProof/>
+            <w:webHidden/>
+          </w:rPr>
+          <w:instrText xml:space="preserve"> PAGEREF _Toc228477434 \h </w:instrText>
+        </w:r>
+        <w:r>
+          <w:rPr>
+            <w:noProof/>
+            <w:webHidden/>
+          </w:rPr>
+        </w:r>
+        <w:r>
+          <w:rPr>
+            <w:noProof/>
+            <w:webHidden/>
+          </w:rPr>
+          <w:fldChar w:fldCharType="separate"/>
+        </w:r>
+        <w:r>
+          <w:rPr>
+            <w:noProof/>
+            <w:webHidden/>
+          </w:rPr>
+          <w:t>11</w:t>
         </w:r>
         <w:r>
           <w:rPr>
@@ -4207,23 +4337,26 @@
           <w:rFonts w:asciiTheme="minorHAnsi" w:eastAsiaTheme="minorEastAsia" w:hAnsiTheme="minorHAnsi" w:cstheme="minorBidi"/>
           <w:noProof/>
           <w:kern w:val="2"/>
+          <w:sz w:val="24"/>
           <w:lang w:val="en-EE" w:eastAsia="en-GB"/>
           <w14:ligatures w14:val="standardContextual"/>
         </w:rPr>
       </w:pPr>
-      <w:hyperlink w:anchor="_Toc227257309" w:history="1">
+      <w:hyperlink w:anchor="_Toc228477435" w:history="1">
         <w:r>
           <w:rPr>
             <w:rStyle w:val="Hyperlink"/>
             <w:noProof/>
-          </w:rPr>
-          <w:t>2.1.1</w:t>
+            <w:sz w:val="24"/>
+          </w:rPr>
+          <w:t>2.2.1</w:t>
         </w:r>
         <w:r>
           <w:rPr>
             <w:rFonts w:asciiTheme="minorHAnsi" w:eastAsiaTheme="minorEastAsia" w:hAnsiTheme="minorHAnsi" w:cstheme="minorBidi"/>
             <w:noProof/>
             <w:kern w:val="2"/>
+            <w:sz w:val="24"/>
             <w:lang w:val="en-EE" w:eastAsia="en-GB"/>
             <w14:ligatures w14:val="standardContextual"/>
           </w:rPr>
@@ -4233,6 +4366,7 @@
           <w:rPr>
             <w:rStyle w:val="Hyperlink"/>
             <w:noProof/>
+            <w:sz w:val="24"/>
           </w:rPr>
           <w:t>Alapeatüki alapeatükk</w:t>
         </w:r>
@@ -4240,6 +4374,7 @@
           <w:rPr>
             <w:noProof/>
             <w:webHidden/>
+            <w:sz w:val="24"/>
           </w:rPr>
           <w:tab/>
         </w:r>
@@ -4247,6 +4382,7 @@
           <w:rPr>
             <w:noProof/>
             <w:webHidden/>
+            <w:sz w:val="24"/>
           </w:rPr>
           <w:fldChar w:fldCharType="begin"/>
         </w:r>
@@ -4254,19 +4390,22 @@
           <w:rPr>
             <w:noProof/>
             <w:webHidden/>
-          </w:rPr>
-          <w:instrText xml:space="preserve"> PAGEREF _Toc227257309 \h </w:instrText>
+            <w:sz w:val="24"/>
+          </w:rPr>
+          <w:instrText xml:space="preserve"> PAGEREF _Toc228477435 \h </w:instrText>
         </w:r>
         <w:r>
           <w:rPr>
             <w:noProof/>
             <w:webHidden/>
+            <w:sz w:val="24"/>
           </w:rPr>
         </w:r>
         <w:r>
           <w:rPr>
             <w:noProof/>
             <w:webHidden/>
+            <w:sz w:val="24"/>
           </w:rPr>
           <w:fldChar w:fldCharType="separate"/>
         </w:r>
@@ -4274,6 +4413,7 @@
           <w:rPr>
             <w:noProof/>
             <w:webHidden/>
+            <w:sz w:val="24"/>
           </w:rPr>
           <w:t>11</w:t>
         </w:r>
@@ -4281,6 +4421,108 @@
           <w:rPr>
             <w:noProof/>
             <w:webHidden/>
+            <w:sz w:val="24"/>
+          </w:rPr>
+          <w:fldChar w:fldCharType="end"/>
+        </w:r>
+      </w:hyperlink>
+    </w:p>
+    <w:p>
+      <w:pPr>
+        <w:pStyle w:val="TOC3"/>
+        <w:tabs>
+          <w:tab w:val="left" w:pos="1440"/>
+          <w:tab w:val="right" w:leader="dot" w:pos="8494"/>
+        </w:tabs>
+        <w:rPr>
+          <w:rFonts w:asciiTheme="minorHAnsi" w:eastAsiaTheme="minorEastAsia" w:hAnsiTheme="minorHAnsi" w:cstheme="minorBidi"/>
+          <w:noProof/>
+          <w:kern w:val="2"/>
+          <w:sz w:val="24"/>
+          <w:lang w:val="en-EE" w:eastAsia="en-GB"/>
+          <w14:ligatures w14:val="standardContextual"/>
+        </w:rPr>
+      </w:pPr>
+      <w:hyperlink w:anchor="_Toc228477436" w:history="1">
+        <w:r>
+          <w:rPr>
+            <w:rStyle w:val="Hyperlink"/>
+            <w:noProof/>
+            <w:sz w:val="24"/>
+          </w:rPr>
+          <w:t>2.2.2</w:t>
+        </w:r>
+        <w:r>
+          <w:rPr>
+            <w:rFonts w:asciiTheme="minorHAnsi" w:eastAsiaTheme="minorEastAsia" w:hAnsiTheme="minorHAnsi" w:cstheme="minorBidi"/>
+            <w:noProof/>
+            <w:kern w:val="2"/>
+            <w:sz w:val="24"/>
+            <w:lang w:val="en-EE" w:eastAsia="en-GB"/>
+            <w14:ligatures w14:val="standardContextual"/>
+          </w:rPr>
+          <w:tab/>
+        </w:r>
+        <w:r>
+          <w:rPr>
+            <w:rStyle w:val="Hyperlink"/>
+            <w:noProof/>
+            <w:sz w:val="24"/>
+          </w:rPr>
+          <w:t>Alapeatüki alapeatükk</w:t>
+        </w:r>
+        <w:r>
+          <w:rPr>
+            <w:noProof/>
+            <w:webHidden/>
+            <w:sz w:val="24"/>
+          </w:rPr>
+          <w:tab/>
+        </w:r>
+        <w:r>
+          <w:rPr>
+            <w:noProof/>
+            <w:webHidden/>
+            <w:sz w:val="24"/>
+          </w:rPr>
+          <w:fldChar w:fldCharType="begin"/>
+        </w:r>
+        <w:r>
+          <w:rPr>
+            <w:noProof/>
+            <w:webHidden/>
+            <w:sz w:val="24"/>
+          </w:rPr>
+          <w:instrText xml:space="preserve"> PAGEREF _Toc228477436 \h </w:instrText>
+        </w:r>
+        <w:r>
+          <w:rPr>
+            <w:noProof/>
+            <w:webHidden/>
+            <w:sz w:val="24"/>
+          </w:rPr>
+        </w:r>
+        <w:r>
+          <w:rPr>
+            <w:noProof/>
+            <w:webHidden/>
+            <w:sz w:val="24"/>
+          </w:rPr>
+          <w:fldChar w:fldCharType="separate"/>
+        </w:r>
+        <w:r>
+          <w:rPr>
+            <w:noProof/>
+            <w:webHidden/>
+            <w:sz w:val="24"/>
+          </w:rPr>
+          <w:t>12</w:t>
+        </w:r>
+        <w:r>
+          <w:rPr>
+            <w:noProof/>
+            <w:webHidden/>
+            <w:sz w:val="24"/>
           </w:rPr>
           <w:fldChar w:fldCharType="end"/>
         </w:r>
@@ -4300,7 +4542,7 @@
           <w14:ligatures w14:val="standardContextual"/>
         </w:rPr>
       </w:pPr>
-      <w:hyperlink w:anchor="_Toc227257310" w:history="1">
+      <w:hyperlink w:anchor="_Toc228477437" w:history="1">
         <w:r>
           <w:rPr>
             <w:rStyle w:val="Hyperlink"/>
@@ -4344,7 +4586,7 @@
             <w:noProof/>
             <w:webHidden/>
           </w:rPr>
-          <w:instrText xml:space="preserve"> PAGEREF _Toc227257310 \h </w:instrText>
+          <w:instrText xml:space="preserve"> PAGEREF _Toc228477437 \h </w:instrText>
         </w:r>
         <w:r>
           <w:rPr>
@@ -4389,7 +4631,7 @@
           <w14:ligatures w14:val="standardContextual"/>
         </w:rPr>
       </w:pPr>
-      <w:hyperlink w:anchor="_Toc227257311" w:history="1">
+      <w:hyperlink w:anchor="_Toc228477438" w:history="1">
         <w:r>
           <w:rPr>
             <w:rStyle w:val="Hyperlink"/>
@@ -4433,7 +4675,7 @@
             <w:noProof/>
             <w:webHidden/>
           </w:rPr>
-          <w:instrText xml:space="preserve"> PAGEREF _Toc227257311 \h </w:instrText>
+          <w:instrText xml:space="preserve"> PAGEREF _Toc228477438 \h </w:instrText>
         </w:r>
         <w:r>
           <w:rPr>
@@ -4475,7 +4717,7 @@
           <w14:ligatures w14:val="standardContextual"/>
         </w:rPr>
       </w:pPr>
-      <w:hyperlink w:anchor="_Toc227257312" w:history="1">
+      <w:hyperlink w:anchor="_Toc228477439" w:history="1">
         <w:r>
           <w:rPr>
             <w:rStyle w:val="Hyperlink"/>
@@ -4502,7 +4744,7 @@
             <w:noProof/>
             <w:webHidden/>
           </w:rPr>
-          <w:instrText xml:space="preserve"> PAGEREF _Toc227257312 \h </w:instrText>
+          <w:instrText xml:space="preserve"> PAGEREF _Toc228477439 \h </w:instrText>
         </w:r>
         <w:r>
           <w:rPr>
@@ -4544,7 +4786,7 @@
           <w14:ligatures w14:val="standardContextual"/>
         </w:rPr>
       </w:pPr>
-      <w:hyperlink w:anchor="_Toc227257313" w:history="1">
+      <w:hyperlink w:anchor="_Toc228477440" w:history="1">
         <w:r>
           <w:rPr>
             <w:rStyle w:val="Hyperlink"/>
@@ -4571,7 +4813,7 @@
             <w:noProof/>
             <w:webHidden/>
           </w:rPr>
-          <w:instrText xml:space="preserve"> PAGEREF _Toc227257313 \h </w:instrText>
+          <w:instrText xml:space="preserve"> PAGEREF _Toc228477440 \h </w:instrText>
         </w:r>
         <w:r>
           <w:rPr>
@@ -4613,7 +4855,7 @@
           <w14:ligatures w14:val="standardContextual"/>
         </w:rPr>
       </w:pPr>
-      <w:hyperlink w:anchor="_Toc227257314" w:history="1">
+      <w:hyperlink w:anchor="_Toc228477441" w:history="1">
         <w:r>
           <w:rPr>
             <w:rStyle w:val="Hyperlink"/>
@@ -4640,7 +4882,7 @@
             <w:noProof/>
             <w:webHidden/>
           </w:rPr>
-          <w:instrText xml:space="preserve"> PAGEREF _Toc227257314 \h </w:instrText>
+          <w:instrText xml:space="preserve"> PAGEREF _Toc228477441 \h </w:instrText>
         </w:r>
         <w:r>
           <w:rPr>
@@ -4682,7 +4924,7 @@
           <w14:ligatures w14:val="standardContextual"/>
         </w:rPr>
       </w:pPr>
-      <w:hyperlink w:anchor="_Toc227257315" w:history="1">
+      <w:hyperlink w:anchor="_Toc228477442" w:history="1">
         <w:r>
           <w:rPr>
             <w:rStyle w:val="Hyperlink"/>
@@ -4709,7 +4951,7 @@
             <w:noProof/>
             <w:webHidden/>
           </w:rPr>
-          <w:instrText xml:space="preserve"> PAGEREF _Toc227257315 \h </w:instrText>
+          <w:instrText xml:space="preserve"> PAGEREF _Toc228477442 \h </w:instrText>
         </w:r>
         <w:r>
           <w:rPr>
@@ -4765,8 +5007,16 @@
     <w:p>
       <w:pPr>
         <w:pStyle w:val="Heading"/>
-      </w:pPr>
-      <w:r>
+        <w:rPr>
+          <w:sz w:val="32"/>
+          <w:szCs w:val="32"/>
+        </w:rPr>
+      </w:pPr>
+      <w:r>
+        <w:rPr>
+          <w:sz w:val="32"/>
+          <w:szCs w:val="32"/>
+        </w:rPr>
         <w:lastRenderedPageBreak/>
         <w:t>Jooniste loetelu</w:t>
       </w:r>
@@ -5016,8 +5266,16 @@
     <w:p>
       <w:pPr>
         <w:pStyle w:val="Heading"/>
-      </w:pPr>
-      <w:r>
+        <w:rPr>
+          <w:sz w:val="32"/>
+          <w:szCs w:val="32"/>
+        </w:rPr>
+      </w:pPr>
+      <w:r>
+        <w:rPr>
+          <w:sz w:val="32"/>
+          <w:szCs w:val="32"/>
+        </w:rPr>
         <w:lastRenderedPageBreak/>
         <w:t>Tabelite loetelu</w:t>
       </w:r>
@@ -5124,7 +5382,7 @@
       <w:pPr>
         <w:pStyle w:val="Heading1"/>
       </w:pPr>
-      <w:bookmarkStart w:id="1" w:name="_Toc227257306"/>
+      <w:bookmarkStart w:id="1" w:name="_Toc228477431"/>
       <w:r>
         <w:lastRenderedPageBreak/>
         <w:t>Sissejuhatus</w:t>
@@ -5197,7 +5455,7 @@
       <w:pPr>
         <w:pStyle w:val="Heading1"/>
       </w:pPr>
-      <w:bookmarkStart w:id="2" w:name="_Toc227257307"/>
+      <w:bookmarkStart w:id="2" w:name="_Toc228477432"/>
       <w:r>
         <w:lastRenderedPageBreak/>
         <w:t>Esimene põhip</w:t>
@@ -5259,15 +5517,21 @@
     <w:p>
       <w:pPr>
         <w:pStyle w:val="Heading2"/>
-      </w:pPr>
-      <w:bookmarkStart w:id="3" w:name="_Toc227257308"/>
-      <w:r>
-        <w:t>Alap</w:t>
-      </w:r>
-      <w:r>
-        <w:t>eatük</w:t>
-      </w:r>
-      <w:r>
+        <w:rPr>
+          <w:szCs w:val="28"/>
+        </w:rPr>
+      </w:pPr>
+      <w:bookmarkStart w:id="3" w:name="_Toc228477433"/>
+      <w:r>
+        <w:rPr>
+          <w:szCs w:val="28"/>
+        </w:rPr>
+        <w:t>Alapeatük</w:t>
+      </w:r>
+      <w:r>
+        <w:rPr>
+          <w:szCs w:val="28"/>
+        </w:rPr>
         <w:t>k</w:t>
       </w:r>
       <w:bookmarkEnd w:id="3"/>
@@ -5359,20 +5623,53 @@
     <w:p>
       <w:pPr>
         <w:pStyle w:val="Caption"/>
+        <w:rPr>
+          <w:szCs w:val="20"/>
+        </w:rPr>
       </w:pPr>
       <w:bookmarkStart w:id="4" w:name="_Toc227257332"/>
       <w:r>
+        <w:rPr>
+          <w:szCs w:val="20"/>
+        </w:rPr>
         <w:t xml:space="preserve">Joonis </w:t>
       </w:r>
-      <w:fldSimple w:instr=" SEQ Joonis \* ARABIC ">
-        <w:r>
-          <w:rPr>
-            <w:noProof/>
-          </w:rPr>
-          <w:t>1</w:t>
-        </w:r>
-      </w:fldSimple>
-      <w:r>
+      <w:r>
+        <w:rPr>
+          <w:szCs w:val="20"/>
+        </w:rPr>
+        <w:fldChar w:fldCharType="begin"/>
+      </w:r>
+      <w:r>
+        <w:rPr>
+          <w:szCs w:val="20"/>
+        </w:rPr>
+        <w:instrText xml:space="preserve"> SEQ Joonis \* ARABIC </w:instrText>
+      </w:r>
+      <w:r>
+        <w:rPr>
+          <w:szCs w:val="20"/>
+        </w:rPr>
+        <w:fldChar w:fldCharType="separate"/>
+      </w:r>
+      <w:r>
+        <w:rPr>
+          <w:noProof/>
+          <w:szCs w:val="20"/>
+        </w:rPr>
+        <w:t>1</w:t>
+      </w:r>
+      <w:r>
+        <w:rPr>
+          <w:noProof/>
+          <w:szCs w:val="20"/>
+        </w:rPr>
+        <w:fldChar w:fldCharType="end"/>
+      </w:r>
+      <w:r>
+        <w:rPr>
+          <w:szCs w:val="20"/>
+        </w:rPr>
         <w:t>. Pudelipost - näidispilt valideerimisreeglite kontrollimiseks.</w:t>
       </w:r>
       <w:bookmarkEnd w:id="4"/>
@@ -5399,15 +5696,23 @@
       <w:pPr>
         <w:pStyle w:val="Heading2"/>
       </w:pPr>
+      <w:bookmarkStart w:id="5" w:name="_Toc228477434"/>
       <w:r>
         <w:t>Alap</w:t>
       </w:r>
       <w:r>
-        <w:t>eatük</w:t>
+        <w:rPr>
+          <w:szCs w:val="28"/>
+        </w:rPr>
+        <w:t>ea</w:t>
+      </w:r>
+      <w:r>
+        <w:t>tük</w:t>
       </w:r>
       <w:r>
         <w:t>k</w:t>
       </w:r>
+      <w:bookmarkEnd w:id="5"/>
     </w:p>
     <w:p>
       <w:r>
@@ -5418,26 +5723,56 @@
       <w:pPr>
         <w:pStyle w:val="Caption"/>
         <w:keepNext/>
-      </w:pPr>
-      <w:bookmarkStart w:id="5" w:name="_Toc227257325"/>
-      <w:r>
+        <w:rPr>
+          <w:szCs w:val="20"/>
+        </w:rPr>
+      </w:pPr>
+      <w:bookmarkStart w:id="6" w:name="_Toc227257325"/>
+      <w:r>
+        <w:rPr>
+          <w:szCs w:val="20"/>
+        </w:rPr>
         <w:t xml:space="preserve">Tabel </w:t>
       </w:r>
-      <w:fldSimple w:instr=" SEQ Tabel \* ARABIC ">
-        <w:r>
-          <w:rPr>
-            <w:noProof/>
-          </w:rPr>
-          <w:t>1</w:t>
-        </w:r>
-      </w:fldSimple>
-      <w:r>
-        <w:t xml:space="preserve">. Näidistabel </w:t>
-      </w:r>
-      <w:r>
-        <w:t>valideerimisreeglite kontrollimiseks.</w:t>
-      </w:r>
-      <w:bookmarkEnd w:id="5"/>
+      <w:r>
+        <w:rPr>
+          <w:szCs w:val="20"/>
+        </w:rPr>
+        <w:fldChar w:fldCharType="begin"/>
+      </w:r>
+      <w:r>
+        <w:rPr>
+          <w:szCs w:val="20"/>
+        </w:rPr>
+        <w:instrText xml:space="preserve"> SEQ Tabel \* ARABIC </w:instrText>
+      </w:r>
+      <w:r>
+        <w:rPr>
+          <w:szCs w:val="20"/>
+        </w:rPr>
+        <w:fldChar w:fldCharType="separate"/>
+      </w:r>
+      <w:r>
+        <w:rPr>
+          <w:noProof/>
+          <w:szCs w:val="20"/>
+        </w:rPr>
+        <w:t>1</w:t>
+      </w:r>
+      <w:r>
+        <w:rPr>
+          <w:noProof/>
+          <w:szCs w:val="20"/>
+        </w:rPr>
+        <w:fldChar w:fldCharType="end"/>
+      </w:r>
+      <w:r>
+        <w:rPr>
+          <w:szCs w:val="20"/>
+        </w:rPr>
+        <w:t>. Näidistabel valideerimisreeglite kontrollimiseks.</w:t>
+      </w:r>
+      <w:bookmarkEnd w:id="6"/>
     </w:p>
     <w:tbl>
       <w:tblPr>
@@ -5503,12 +5838,14 @@
               <w:rPr>
                 <w:b/>
                 <w:bCs/>
+                <w:szCs w:val="22"/>
               </w:rPr>
             </w:pPr>
             <w:r>
               <w:rPr>
                 <w:b/>
                 <w:bCs/>
+                <w:szCs w:val="22"/>
               </w:rPr>
               <w:t>Tabeli veerg 3</w:t>
             </w:r>
@@ -5523,8 +5860,14 @@
           <w:p>
             <w:pPr>
               <w:pStyle w:val="Tabletext"/>
+              <w:rPr>
+                <w:szCs w:val="22"/>
+              </w:rPr>
             </w:pPr>
             <w:r>
+              <w:rPr>
+                <w:szCs w:val="22"/>
+              </w:rPr>
               <w:t>Siin on tabeli tekst</w:t>
             </w:r>
           </w:p>
@@ -5601,18 +5944,24 @@
     <w:p>
       <w:pPr>
         <w:pStyle w:val="Heading3"/>
-      </w:pPr>
-      <w:bookmarkStart w:id="6" w:name="_Toc227257309"/>
-      <w:r>
-        <w:t>Alapeat</w:t>
-      </w:r>
-      <w:r>
-        <w:t xml:space="preserve">üki </w:t>
-      </w:r>
-      <w:r>
+        <w:rPr>
+          <w:szCs w:val="24"/>
+        </w:rPr>
+      </w:pPr>
+      <w:bookmarkStart w:id="7" w:name="_Toc228477435"/>
+      <w:r>
+        <w:rPr>
+          <w:szCs w:val="24"/>
+        </w:rPr>
+        <w:t xml:space="preserve">Alapeatüki </w:t>
+      </w:r>
+      <w:r>
+        <w:rPr>
+          <w:szCs w:val="24"/>
+        </w:rPr>
         <w:t>alapeatükk</w:t>
       </w:r>
-      <w:bookmarkEnd w:id="6"/>
+      <w:bookmarkEnd w:id="7"/>
     </w:p>
     <w:p>
       <w:r>
@@ -5984,7 +6333,7 @@
       <w:pPr>
         <w:pStyle w:val="Caption"/>
       </w:pPr>
-      <w:bookmarkStart w:id="7" w:name="_Toc227257333"/>
+      <w:bookmarkStart w:id="8" w:name="_Toc227257333"/>
       <w:r>
         <w:t xml:space="preserve">Joonis </w:t>
       </w:r>
@@ -5999,7 +6348,7 @@
       <w:r>
         <w:t>. Näidisjoonis valideerimisreeglite kontrollimiseks.</w:t>
       </w:r>
-      <w:bookmarkEnd w:id="7"/>
+      <w:bookmarkEnd w:id="8"/>
     </w:p>
     <w:p>
       <w:r>
@@ -6010,6 +6359,7 @@
       <w:pPr>
         <w:pStyle w:val="Heading3"/>
       </w:pPr>
+      <w:bookmarkStart w:id="9" w:name="_Toc228477436"/>
       <w:r>
         <w:lastRenderedPageBreak/>
         <w:t>Alapeat</w:t>
@@ -6018,8 +6368,18 @@
         <w:t xml:space="preserve">üki </w:t>
       </w:r>
       <w:r>
-        <w:t>alapeatükk</w:t>
-      </w:r>
+        <w:t>a</w:t>
+      </w:r>
+      <w:r>
+        <w:rPr>
+          <w:szCs w:val="24"/>
+        </w:rPr>
+        <w:t>lape</w:t>
+      </w:r>
+      <w:r>
+        <w:t>atükk</w:t>
+      </w:r>
+      <w:bookmarkEnd w:id="9"/>
     </w:p>
     <w:p>
       <w:r>
@@ -6385,7 +6745,7 @@
       <w:pPr>
         <w:pStyle w:val="Caption"/>
       </w:pPr>
-      <w:bookmarkStart w:id="8" w:name="_Toc227257334"/>
+      <w:bookmarkStart w:id="10" w:name="_Toc227257334"/>
       <w:r>
         <w:t xml:space="preserve">Joonis </w:t>
       </w:r>
@@ -6397,7 +6757,7 @@
       <w:r>
         <w:t>. Näidisjoonis valideerimisreeglite kontrollimiseks.</w:t>
       </w:r>
-      <w:bookmarkEnd w:id="8"/>
+      <w:bookmarkEnd w:id="10"/>
     </w:p>
     <w:p/>
     <w:p>
@@ -6414,12 +6774,12 @@
       <w:pPr>
         <w:pStyle w:val="Heading1"/>
       </w:pPr>
-      <w:bookmarkStart w:id="9" w:name="_Toc227257310"/>
+      <w:bookmarkStart w:id="11" w:name="_Toc228477437"/>
       <w:r>
         <w:lastRenderedPageBreak/>
         <w:t>Teine põhipeatükk</w:t>
       </w:r>
-      <w:bookmarkEnd w:id="9"/>
+      <w:bookmarkEnd w:id="11"/>
     </w:p>
     <w:p>
       <w:r>
@@ -7335,7 +7695,7 @@
           <w:b/>
         </w:rPr>
       </w:pPr>
-      <w:bookmarkStart w:id="10" w:name="_Toc227257311"/>
+      <w:bookmarkStart w:id="12" w:name="_Toc228477438"/>
       <w:r>
         <w:rPr>
           <w:rStyle w:val="Heading1Char"/>
@@ -7344,7 +7704,7 @@
         <w:lastRenderedPageBreak/>
         <w:t>Kokkuvõte</w:t>
       </w:r>
-      <w:bookmarkEnd w:id="10"/>
+      <w:bookmarkEnd w:id="12"/>
     </w:p>
     <w:p>
       <w:r>
@@ -7381,7 +7741,7 @@
       <w:pPr>
         <w:pStyle w:val="Headingunnumber"/>
       </w:pPr>
-      <w:bookmarkStart w:id="11" w:name="_Toc227257312"/>
+      <w:bookmarkStart w:id="13" w:name="_Toc228477439"/>
       <w:r>
         <w:lastRenderedPageBreak/>
         <w:t xml:space="preserve">Kasutatud </w:t>
@@ -7389,7 +7749,7 @@
       <w:r>
         <w:t>kirjandus</w:t>
       </w:r>
-      <w:bookmarkEnd w:id="11"/>
+      <w:bookmarkEnd w:id="13"/>
     </w:p>
     <w:p>
       <w:pPr>
@@ -7419,7 +7779,7 @@
       <w:pPr>
         <w:pStyle w:val="Headingunnumber"/>
       </w:pPr>
-      <w:bookmarkStart w:id="12" w:name="_Toc227257313"/>
+      <w:bookmarkStart w:id="14" w:name="_Toc228477440"/>
       <w:r>
         <w:lastRenderedPageBreak/>
         <w:t xml:space="preserve">Lisa 1 </w:t>
@@ -7445,14 +7805,14 @@
         </w:rPr>
         <w:footnoteReference w:id="1"/>
       </w:r>
-      <w:bookmarkEnd w:id="12"/>
-    </w:p>
-    <w:p>
-      <w:bookmarkStart w:id="13" w:name="_Toc54349730"/>
+      <w:bookmarkEnd w:id="14"/>
+    </w:p>
+    <w:p>
+      <w:bookmarkStart w:id="15" w:name="_Toc54349730"/>
       <w:r>
         <w:t>Mina,</w:t>
       </w:r>
-      <w:bookmarkEnd w:id="13"/>
+      <w:bookmarkEnd w:id="15"/>
       <w:r>
         <w:t xml:space="preserve"> Mari Maasikas</w:t>
       </w:r>
@@ -7584,12 +7944,12 @@
       <w:pPr>
         <w:pStyle w:val="Headingunnumber"/>
       </w:pPr>
-      <w:bookmarkStart w:id="14" w:name="_Toc227257314"/>
+      <w:bookmarkStart w:id="16" w:name="_Toc228477441"/>
       <w:r>
         <w:lastRenderedPageBreak/>
         <w:t>Lisa 2 – Teine lisa</w:t>
       </w:r>
-      <w:bookmarkEnd w:id="14"/>
+      <w:bookmarkEnd w:id="16"/>
     </w:p>
     <w:p>
       <w:pPr>
@@ -7617,12 +7977,12 @@
       <w:pPr>
         <w:pStyle w:val="Headingunnumber"/>
       </w:pPr>
-      <w:bookmarkStart w:id="15" w:name="_Toc227257315"/>
+      <w:bookmarkStart w:id="17" w:name="_Toc228477442"/>
       <w:r>
         <w:lastRenderedPageBreak/>
         <w:t>Lisa 3 – Kolmas lisa</w:t>
       </w:r>
-      <w:bookmarkEnd w:id="15"/>
+      <w:bookmarkEnd w:id="17"/>
     </w:p>
     <w:tbl>
       <w:tblPr>
@@ -7646,12 +8006,14 @@
               <w:rPr>
                 <w:b/>
                 <w:bCs/>
+                <w:sz w:val="24"/>
               </w:rPr>
             </w:pPr>
             <w:r>
               <w:rPr>
                 <w:b/>
                 <w:bCs/>
+                <w:sz w:val="24"/>
               </w:rPr>
               <w:t>Tabeli veerg 1</w:t>
             </w:r>
@@ -7667,12 +8029,14 @@
               <w:rPr>
                 <w:b/>
                 <w:bCs/>
+                <w:sz w:val="24"/>
               </w:rPr>
             </w:pPr>
             <w:r>
               <w:rPr>
                 <w:b/>
                 <w:bCs/>
+                <w:sz w:val="24"/>
               </w:rPr>
               <w:t>Tabeli veerg 2</w:t>
             </w:r>
@@ -7688,12 +8052,14 @@
               <w:rPr>
                 <w:b/>
                 <w:bCs/>
+                <w:sz w:val="24"/>
               </w:rPr>
             </w:pPr>
             <w:r>
               <w:rPr>
                 <w:b/>
                 <w:bCs/>
+                <w:sz w:val="24"/>
               </w:rPr>
               <w:t>Tabeli veerg 3</w:t>
             </w:r>
@@ -7708,8 +8074,14 @@
           <w:p>
             <w:pPr>
               <w:pStyle w:val="Tabletext"/>
+              <w:rPr>
+                <w:sz w:val="24"/>
+              </w:rPr>
             </w:pPr>
             <w:r>
+              <w:rPr>
+                <w:sz w:val="24"/>
+              </w:rPr>
               <w:t>Siin on tabeli tekst</w:t>
             </w:r>
           </w:p>
@@ -7721,8 +8093,14 @@
           <w:p>
             <w:pPr>
               <w:pStyle w:val="Tabletext"/>
+              <w:rPr>
+                <w:sz w:val="24"/>
+              </w:rPr>
             </w:pPr>
             <w:r>
+              <w:rPr>
+                <w:sz w:val="24"/>
+              </w:rPr>
               <w:t>Siin on tabeli tekst</w:t>
             </w:r>
           </w:p>
@@ -7734,8 +8112,14 @@
           <w:p>
             <w:pPr>
               <w:pStyle w:val="Tabletext"/>
+              <w:rPr>
+                <w:sz w:val="24"/>
+              </w:rPr>
             </w:pPr>
             <w:r>
+              <w:rPr>
+                <w:sz w:val="24"/>
+              </w:rPr>
               <w:t>Siin on tabeli tekst</w:t>
             </w:r>
           </w:p>
@@ -7749,8 +8133,14 @@
           <w:p>
             <w:pPr>
               <w:pStyle w:val="Tabletext"/>
+              <w:rPr>
+                <w:sz w:val="24"/>
+              </w:rPr>
             </w:pPr>
             <w:r>
+              <w:rPr>
+                <w:sz w:val="24"/>
+              </w:rPr>
               <w:t>Siin on tabeli tekst</w:t>
             </w:r>
           </w:p>
@@ -7762,8 +8152,14 @@
           <w:p>
             <w:pPr>
               <w:pStyle w:val="Tabletext"/>
+              <w:rPr>
+                <w:sz w:val="24"/>
+              </w:rPr>
             </w:pPr>
             <w:r>
+              <w:rPr>
+                <w:sz w:val="24"/>
+              </w:rPr>
               <w:t>Siin on tabeli tekst</w:t>
             </w:r>
           </w:p>
@@ -7775,8 +8171,14 @@
           <w:p>
             <w:pPr>
               <w:pStyle w:val="Tabletext"/>
+              <w:rPr>
+                <w:sz w:val="24"/>
+              </w:rPr>
             </w:pPr>
             <w:r>
+              <w:rPr>
+                <w:sz w:val="24"/>
+              </w:rPr>
               <w:t>Siin on tabeli tekst</w:t>
             </w:r>
           </w:p>
@@ -10619,7 +11021,7 @@
     <w:autoRedefine/>
     <w:uiPriority w:val="39"/>
     <w:unhideWhenUsed/>
-    <w:rsid w:val="00612DC7"/>
+    <w:rsid w:val="00C9682F"/>
     <w:pPr>
       <w:tabs>
         <w:tab w:val="right" w:leader="dot" w:pos="8494"/>
@@ -10648,11 +11050,14 @@
     <w:autoRedefine/>
     <w:uiPriority w:val="39"/>
     <w:unhideWhenUsed/>
-    <w:rsid w:val="00612DC7"/>
+    <w:rsid w:val="00C9682F"/>
     <w:pPr>
       <w:spacing w:after="100"/>
       <w:ind w:left="482"/>
     </w:pPr>
+    <w:rPr>
+      <w:sz w:val="26"/>
+    </w:rPr>
   </w:style>
   <w:style w:type="character" w:styleId="Hyperlink">
     <w:name w:val="Hyperlink"/>
@@ -10688,7 +11093,7 @@
     <w:name w:val="Heading"/>
     <w:basedOn w:val="Normal"/>
     <w:qFormat/>
-    <w:rsid w:val="00AA1435"/>
+    <w:rsid w:val="00B90BFC"/>
     <w:pPr>
       <w:spacing w:before="1200" w:after="360"/>
       <w:jc w:val="left"/>
@@ -10696,7 +11101,7 @@
     <w:rPr>
       <w:b/>
       <w:bCs/>
-      <w:sz w:val="32"/>
+      <w:sz w:val="28"/>
     </w:rPr>
   </w:style>
   <w:style w:type="paragraph" w:customStyle="1" w:styleId="NormalBold">

</xml_diff>